<commit_message>
fix(c08): rafinari ARHITECT - motto "O harta completa" + F5 "LIMBI DIFERITE"
- MOTTO: "Un ecosistem cunoscut" (abstract) -> "O harta completa. Apoi orice
  decizie." (concret/vizual, pastreaza cadenta seriei set/profil/memorie/harta).
- F5 "CONVENTII DE ALINIAT" (prea tehnic, miroase a C09) -> "LIMBI DIFERITE":
  descriptiv, metaforic, legat de "cu cine vorbeste setul". Fenomenul = seturile
  nu vorbesc inca aceeasi limba, nu "alinierea". Aplicat in inv/anomaly/final/FILM.

audit_sync 80/80 ZERO DRIFT.

https://claude.ai/code/session_011hdPJf3hrU8AgLAMEvh9c2
</commit_message>
<xml_diff>
--- a/c08/FILM-Excel-08-Cartografiere.docx
+++ b/c08/FILM-Excel-08-Cartografiere.docx
@@ -164,7 +164,7 @@
           <w:rFonts w:ascii="Calibri" w:hAnsi="Calibri"/>
           <w:sz w:val="20"/>
         </w:rPr>
-        <w:t>Un ecosistem cunoscut. Apoi orice decizie.</w:t>
+        <w:t>O hartă completă. Apoi orice decizie.</w:t>
       </w:r>
     </w:p>
     <w:p>
@@ -495,7 +495,7 @@
           <w:rFonts w:ascii="Calibri" w:hAnsi="Calibri"/>
           <w:sz w:val="20"/>
         </w:rPr>
-        <w:t>Constructia 08 ECOSISTEMUL SETULUI preia setul de la constructia precedenta. C07 a citit memoria temporala a setului. C08 cartografiaza ecosistemul: ce seturi-satelit il descriu, ce chei le leaga, ce rol joaca fiecare, ce campuri externe exista si ce conventii trebuie aliniate inainte de modelare.</w:t>
+        <w:t>Constructia 08 ECOSISTEMUL SETULUI preia setul de la constructia precedenta. C07 a citit memoria temporala a setului. C08 cartografiaza ecosistemul: ce seturi-satelit il descriu, ce chei le leaga, ce rol joaca fiecare, ce campuri externe exista si in ce nu vorbesc inca aceeasi limba.</w:t>
       </w:r>
     </w:p>
     <w:p>
@@ -719,7 +719,7 @@
           <w:color w:val="333333"/>
           <w:sz w:val="22"/>
         </w:rPr>
-        <w:t>05 · CONVENTII DE ALINIAT</w:t>
+        <w:t>05 · LIMBI DIFERITE</w:t>
       </w:r>
     </w:p>
     <w:p>
@@ -731,7 +731,7 @@
           <w:rFonts w:ascii="Calibri" w:hAnsi="Calibri"/>
           <w:sz w:val="20"/>
         </w:rPr>
-        <w:t>formate si denumiri care difera intre foi; recunoscute, nu aliniate (alinierea = C09)</w:t>
+        <w:t>seturile nu vorbesc inca aceeasi limba: formate si denumiri care difera intre foi</w:t>
       </w:r>
     </w:p>
     <w:p>

</xml_diff>

<commit_message>
fix(c08 + film c01-c08): MIZA cinematica + WOW + rol "CONTROL UMAN"
Rafinari ARHITECT pe C08:
1. MIZA: "Nu unim, nu modelam (acelea sunt C09)" (nota tehnica) -> "Relatiile
   exista deja. Noi doar le facem vizibile." (cinematic). FILM + red-box studiu.
2. WOW: "setul are vecini, chei si roluri" -> "Pentru prima data, setul nu mai
   este singur." (forta emotionala la nivelul C07). FILM + accent HTML studiu/video.
3. ROLURI: "OPERATORUL"/"NOI" -> "CONTROL UMAN" standardizat in toate 8 FILM-urile
   (AI / Excel / Control uman, nu "Operator" - suna a scoala).

audit_sync 80/80 ZERO DRIFT.

https://claude.ai/code/session_011hdPJf3hrU8AgLAMEvh9c2
</commit_message>
<xml_diff>
--- a/c08/FILM-Excel-08-Cartografiere.docx
+++ b/c08/FILM-Excel-08-Cartografiere.docx
@@ -92,7 +92,7 @@
           <w:rFonts w:ascii="Calibri" w:hAnsi="Calibri"/>
           <w:sz w:val="20"/>
         </w:rPr>
-        <w:t>Obținem harta ecosistemului de date din jurul setului: cu cine vorbește, prin ce chei, cu ce roluri. Nu unim, nu modelăm (acelea sunt C09).</w:t>
+        <w:t>Obținem harta ecosistemului de date din jurul setului: cu cine vorbește, prin ce chei și cu ce roluri. Relațiile există deja. Noi doar le facem vizibile.</w:t>
       </w:r>
     </w:p>
     <w:p>
@@ -140,7 +140,7 @@
           <w:rFonts w:ascii="Calibri" w:hAnsi="Calibri"/>
           <w:sz w:val="20"/>
         </w:rPr>
-        <w:t>Pentru prima dată, setul are vecini, chei și roluri.</w:t>
+        <w:t>Pentru prima dată, setul nu mai este singur.</w:t>
       </w:r>
     </w:p>
     <w:p>
@@ -582,7 +582,7 @@
           <w:color w:val="333333"/>
           <w:sz w:val="22"/>
         </w:rPr>
-        <w:t>NOI</w:t>
+        <w:t>CONTROL UMAN</w:t>
       </w:r>
     </w:p>
     <w:p>

</xml_diff>

<commit_message>
fix(c08): inchide reziduuri audit non-imagine (R1 AHA in FILM, R3 recunoastere live MATCH/COUNTA, R4 alt hero)
</commit_message>
<xml_diff>
--- a/c08/FILM-Excel-08-Cartografiere.docx
+++ b/c08/FILM-Excel-08-Cartografiere.docx
@@ -93,6 +93,30 @@
           <w:sz w:val="20"/>
         </w:rPr>
         <w:t>Obținem harta ecosistemului de date din jurul setului: cu cine vorbește, prin ce chei și cu ce roluri. Relațiile există deja. Noi doar le facem vizibile.</w:t>
+      </w:r>
+    </w:p>
+    <w:p>
+      <w:pPr>
+        <w:spacing w:before="200" w:after="80"/>
+      </w:pPr>
+      <w:r>
+        <w:rPr>
+          <w:b/>
+          <w:sz w:val="26"/>
+        </w:rPr>
+        <w:t>AHA (INSIGHT)</w:t>
+      </w:r>
+    </w:p>
+    <w:p>
+      <w:pPr>
+        <w:spacing w:after="80"/>
+      </w:pPr>
+      <w:r>
+        <w:rPr>
+          <w:rFonts w:ascii="Calibri" w:hAnsi="Calibri"/>
+          <w:sz w:val="20"/>
+        </w:rPr>
+        <w:t>Cele mai importante date despre un rând nu sunt în rând.</w:t>
       </w:r>
     </w:p>
     <w:p>

</xml_diff>